<commit_message>
Task1 part 1 completed
</commit_message>
<xml_diff>
--- a/1.AWS_static_website/Part1/AWS_static_website_part1.docx
+++ b/1.AWS_static_website/Part1/AWS_static_website_part1.docx
@@ -2,6 +2,1158 @@
 <file path=word/document.xml><?xml version="1.0" encoding="utf-8"?>
 <w:document xmlns:wpc="http://schemas.microsoft.com/office/word/2010/wordprocessingCanvas" xmlns:cx="http://schemas.microsoft.com/office/drawing/2014/chartex" xmlns:cx1="http://schemas.microsoft.com/office/drawing/2015/9/8/chartex" xmlns:cx2="http://schemas.microsoft.com/office/drawing/2015/10/21/chartex" xmlns:cx3="http://schemas.microsoft.com/office/drawing/2016/5/9/chartex" xmlns:cx4="http://schemas.microsoft.com/office/drawing/2016/5/10/chartex" xmlns:cx5="http://schemas.microsoft.com/office/drawing/2016/5/11/chartex" xmlns:cx6="http://schemas.microsoft.com/office/drawing/2016/5/12/chartex" xmlns:cx7="http://schemas.microsoft.com/office/drawing/2016/5/13/chartex" xmlns:cx8="http://schemas.microsoft.com/office/drawing/2016/5/14/chartex" xmlns:mc="http://schemas.openxmlformats.org/markup-compatibility/2006" xmlns:aink="http://schemas.microsoft.com/office/drawing/2016/ink" xmlns:am3d="http://schemas.microsoft.com/office/drawing/2017/model3d" xmlns:o="urn:schemas-microsoft-com:office:office" xmlns:oel="http://schemas.microsoft.com/office/2019/extlst" xmlns:r="http://schemas.openxmlformats.org/officeDocument/2006/relationships" xmlns:m="http://schemas.openxmlformats.org/officeDocument/2006/math" xmlns:v="urn:schemas-microsoft-com:vml" xmlns:wp14="http://schemas.microsoft.com/office/word/2010/wordprocessingDrawing" xmlns:wp="http://schemas.openxmlformats.org/drawingml/2006/wordprocessingDrawing" xmlns:w10="urn:schemas-microsoft-com:office:word" xmlns:w="http://schemas.openxmlformats.org/wordprocessingml/2006/main" xmlns:w14="http://schemas.microsoft.com/office/word/2010/wordml" xmlns:w15="http://schemas.microsoft.com/office/word/2012/wordml" xmlns:w16cex="http://schemas.microsoft.com/office/word/2018/wordml/cex" xmlns:w16cid="http://schemas.microsoft.com/office/word/2016/wordml/cid" xmlns:w16="http://schemas.microsoft.com/office/word/2018/wordml" xmlns:w16du="http://schemas.microsoft.com/office/word/2023/wordml/word16du" xmlns:w16sdtdh="http://schemas.microsoft.com/office/word/2020/wordml/sdtdatahash" xmlns:w16sdtfl="http://schemas.microsoft.com/office/word/2024/wordml/sdtformatlock" xmlns:w16se="http://schemas.microsoft.com/office/word/2015/wordml/symex" xmlns:wpg="http://schemas.microsoft.com/office/word/2010/wordprocessingGroup" xmlns:wpi="http://schemas.microsoft.com/office/word/2010/wordprocessingInk" xmlns:wne="http://schemas.microsoft.com/office/word/2006/wordml" xmlns:wps="http://schemas.microsoft.com/office/word/2010/wordprocessingShape" mc:Ignorable="w14 w15 w16se w16cid w16 w16cex w16sdtdh w16sdtfl w16du wp14">
   <w:body>
+    <w:p>
+      <w:pPr>
+        <w:pStyle w:val="Akapitzlist"/>
+        <w:numPr>
+          <w:ilvl w:val="0"/>
+          <w:numId w:val="1"/>
+        </w:numPr>
+      </w:pPr>
+      <w:proofErr w:type="spellStart"/>
+      <w:r>
+        <w:t>Creating</w:t>
+      </w:r>
+      <w:proofErr w:type="spellEnd"/>
+      <w:r>
+        <w:t xml:space="preserve"> s3 </w:t>
+      </w:r>
+      <w:proofErr w:type="spellStart"/>
+      <w:r>
+        <w:t>bucket</w:t>
+      </w:r>
+      <w:proofErr w:type="spellEnd"/>
+    </w:p>
+    <w:p>
+      <w:pPr>
+        <w:ind w:left="360"/>
+      </w:pPr>
+      <w:r>
+        <w:drawing>
+          <wp:inline distT="0" distB="0" distL="0" distR="0" wp14:anchorId="2FAA5F01" wp14:editId="5BF8B4F2">
+            <wp:extent cx="5760720" cy="1164590"/>
+            <wp:effectExtent l="0" t="0" r="0" b="0"/>
+            <wp:docPr id="2066885686" name="Obraz 1"/>
+            <wp:cNvGraphicFramePr>
+              <a:graphicFrameLocks xmlns:a="http://schemas.openxmlformats.org/drawingml/2006/main" noChangeAspect="1"/>
+            </wp:cNvGraphicFramePr>
+            <a:graphic xmlns:a="http://schemas.openxmlformats.org/drawingml/2006/main">
+              <a:graphicData uri="http://schemas.openxmlformats.org/drawingml/2006/picture">
+                <pic:pic xmlns:pic="http://schemas.openxmlformats.org/drawingml/2006/picture">
+                  <pic:nvPicPr>
+                    <pic:cNvPr id="2066885686" name=""/>
+                    <pic:cNvPicPr/>
+                  </pic:nvPicPr>
+                  <pic:blipFill>
+                    <a:blip r:embed="rId5"/>
+                    <a:stretch>
+                      <a:fillRect/>
+                    </a:stretch>
+                  </pic:blipFill>
+                  <pic:spPr>
+                    <a:xfrm>
+                      <a:off x="0" y="0"/>
+                      <a:ext cx="5760720" cy="1164590"/>
+                    </a:xfrm>
+                    <a:prstGeom prst="rect">
+                      <a:avLst/>
+                    </a:prstGeom>
+                  </pic:spPr>
+                </pic:pic>
+              </a:graphicData>
+            </a:graphic>
+          </wp:inline>
+        </w:drawing>
+      </w:r>
+    </w:p>
+    <w:p>
+      <w:pPr>
+        <w:pStyle w:val="Akapitzlist"/>
+        <w:numPr>
+          <w:ilvl w:val="0"/>
+          <w:numId w:val="1"/>
+        </w:numPr>
+      </w:pPr>
+      <w:proofErr w:type="spellStart"/>
+      <w:r>
+        <w:t>Uploding</w:t>
+      </w:r>
+      <w:proofErr w:type="spellEnd"/>
+      <w:r>
+        <w:t xml:space="preserve"> </w:t>
+      </w:r>
+      <w:proofErr w:type="spellStart"/>
+      <w:r>
+        <w:t>files</w:t>
+      </w:r>
+      <w:proofErr w:type="spellEnd"/>
+    </w:p>
+    <w:p>
+      <w:pPr>
+        <w:ind w:left="360"/>
+      </w:pPr>
+      <w:r>
+        <w:drawing>
+          <wp:inline distT="0" distB="0" distL="0" distR="0" wp14:anchorId="71AEC3EE" wp14:editId="07180662">
+            <wp:extent cx="5760720" cy="1240790"/>
+            <wp:effectExtent l="0" t="0" r="0" b="0"/>
+            <wp:docPr id="1906297025" name="Obraz 1"/>
+            <wp:cNvGraphicFramePr>
+              <a:graphicFrameLocks xmlns:a="http://schemas.openxmlformats.org/drawingml/2006/main" noChangeAspect="1"/>
+            </wp:cNvGraphicFramePr>
+            <a:graphic xmlns:a="http://schemas.openxmlformats.org/drawingml/2006/main">
+              <a:graphicData uri="http://schemas.openxmlformats.org/drawingml/2006/picture">
+                <pic:pic xmlns:pic="http://schemas.openxmlformats.org/drawingml/2006/picture">
+                  <pic:nvPicPr>
+                    <pic:cNvPr id="1906297025" name=""/>
+                    <pic:cNvPicPr/>
+                  </pic:nvPicPr>
+                  <pic:blipFill>
+                    <a:blip r:embed="rId6"/>
+                    <a:stretch>
+                      <a:fillRect/>
+                    </a:stretch>
+                  </pic:blipFill>
+                  <pic:spPr>
+                    <a:xfrm>
+                      <a:off x="0" y="0"/>
+                      <a:ext cx="5760720" cy="1240790"/>
+                    </a:xfrm>
+                    <a:prstGeom prst="rect">
+                      <a:avLst/>
+                    </a:prstGeom>
+                  </pic:spPr>
+                </pic:pic>
+              </a:graphicData>
+            </a:graphic>
+          </wp:inline>
+        </w:drawing>
+      </w:r>
+    </w:p>
+    <w:p>
+      <w:pPr>
+        <w:pStyle w:val="Akapitzlist"/>
+        <w:numPr>
+          <w:ilvl w:val="0"/>
+          <w:numId w:val="1"/>
+        </w:numPr>
+      </w:pPr>
+      <w:proofErr w:type="spellStart"/>
+      <w:r>
+        <w:t>Permissions</w:t>
+      </w:r>
+      <w:proofErr w:type="spellEnd"/>
+      <w:r>
+        <w:t xml:space="preserve"> with </w:t>
+      </w:r>
+      <w:proofErr w:type="spellStart"/>
+      <w:r>
+        <w:t>BlockPublicAcls</w:t>
+      </w:r>
+      <w:proofErr w:type="spellEnd"/>
+      <w:r>
+        <w:t xml:space="preserve"> = </w:t>
+      </w:r>
+      <w:proofErr w:type="spellStart"/>
+      <w:r>
+        <w:t>true</w:t>
+      </w:r>
+      <w:proofErr w:type="spellEnd"/>
+    </w:p>
+    <w:p>
+      <w:pPr>
+        <w:ind w:left="360"/>
+      </w:pPr>
+      <w:r>
+        <w:drawing>
+          <wp:inline distT="0" distB="0" distL="0" distR="0" wp14:anchorId="51501B25" wp14:editId="3406E0CB">
+            <wp:extent cx="5760720" cy="1468755"/>
+            <wp:effectExtent l="0" t="0" r="0" b="0"/>
+            <wp:docPr id="1776309100" name="Obraz 1"/>
+            <wp:cNvGraphicFramePr>
+              <a:graphicFrameLocks xmlns:a="http://schemas.openxmlformats.org/drawingml/2006/main" noChangeAspect="1"/>
+            </wp:cNvGraphicFramePr>
+            <a:graphic xmlns:a="http://schemas.openxmlformats.org/drawingml/2006/main">
+              <a:graphicData uri="http://schemas.openxmlformats.org/drawingml/2006/picture">
+                <pic:pic xmlns:pic="http://schemas.openxmlformats.org/drawingml/2006/picture">
+                  <pic:nvPicPr>
+                    <pic:cNvPr id="1776309100" name=""/>
+                    <pic:cNvPicPr/>
+                  </pic:nvPicPr>
+                  <pic:blipFill>
+                    <a:blip r:embed="rId7"/>
+                    <a:stretch>
+                      <a:fillRect/>
+                    </a:stretch>
+                  </pic:blipFill>
+                  <pic:spPr>
+                    <a:xfrm>
+                      <a:off x="0" y="0"/>
+                      <a:ext cx="5760720" cy="1468755"/>
+                    </a:xfrm>
+                    <a:prstGeom prst="rect">
+                      <a:avLst/>
+                    </a:prstGeom>
+                  </pic:spPr>
+                </pic:pic>
+              </a:graphicData>
+            </a:graphic>
+          </wp:inline>
+        </w:drawing>
+      </w:r>
+    </w:p>
+    <w:p>
+      <w:pPr>
+        <w:pStyle w:val="Akapitzlist"/>
+        <w:numPr>
+          <w:ilvl w:val="0"/>
+          <w:numId w:val="1"/>
+        </w:numPr>
+      </w:pPr>
+      <w:proofErr w:type="spellStart"/>
+      <w:r>
+        <w:t>Adding</w:t>
+      </w:r>
+      <w:proofErr w:type="spellEnd"/>
+      <w:r>
+        <w:t xml:space="preserve"> </w:t>
+      </w:r>
+      <w:proofErr w:type="spellStart"/>
+      <w:r>
+        <w:t>bucket</w:t>
+      </w:r>
+      <w:proofErr w:type="spellEnd"/>
+      <w:r>
+        <w:t xml:space="preserve"> policy</w:t>
+      </w:r>
+    </w:p>
+    <w:p>
+      <w:pPr>
+        <w:ind w:left="360"/>
+      </w:pPr>
+      <w:r>
+        <w:drawing>
+          <wp:inline distT="0" distB="0" distL="0" distR="0" wp14:anchorId="239D9080" wp14:editId="20404E8D">
+            <wp:extent cx="5760720" cy="2068195"/>
+            <wp:effectExtent l="0" t="0" r="0" b="8255"/>
+            <wp:docPr id="334892987" name="Obraz 1"/>
+            <wp:cNvGraphicFramePr>
+              <a:graphicFrameLocks xmlns:a="http://schemas.openxmlformats.org/drawingml/2006/main" noChangeAspect="1"/>
+            </wp:cNvGraphicFramePr>
+            <a:graphic xmlns:a="http://schemas.openxmlformats.org/drawingml/2006/main">
+              <a:graphicData uri="http://schemas.openxmlformats.org/drawingml/2006/picture">
+                <pic:pic xmlns:pic="http://schemas.openxmlformats.org/drawingml/2006/picture">
+                  <pic:nvPicPr>
+                    <pic:cNvPr id="334892987" name=""/>
+                    <pic:cNvPicPr/>
+                  </pic:nvPicPr>
+                  <pic:blipFill>
+                    <a:blip r:embed="rId8"/>
+                    <a:stretch>
+                      <a:fillRect/>
+                    </a:stretch>
+                  </pic:blipFill>
+                  <pic:spPr>
+                    <a:xfrm>
+                      <a:off x="0" y="0"/>
+                      <a:ext cx="5760720" cy="2068195"/>
+                    </a:xfrm>
+                    <a:prstGeom prst="rect">
+                      <a:avLst/>
+                    </a:prstGeom>
+                  </pic:spPr>
+                </pic:pic>
+              </a:graphicData>
+            </a:graphic>
+          </wp:inline>
+        </w:drawing>
+      </w:r>
+    </w:p>
+    <w:p>
+      <w:pPr>
+        <w:ind w:left="360"/>
+      </w:pPr>
+    </w:p>
+    <w:p>
+      <w:pPr>
+        <w:ind w:left="360"/>
+      </w:pPr>
+    </w:p>
+    <w:p>
+      <w:pPr>
+        <w:ind w:left="360"/>
+      </w:pPr>
+    </w:p>
+    <w:p>
+      <w:pPr>
+        <w:ind w:left="360"/>
+      </w:pPr>
+    </w:p>
+    <w:p>
+      <w:pPr>
+        <w:pStyle w:val="Akapitzlist"/>
+        <w:numPr>
+          <w:ilvl w:val="0"/>
+          <w:numId w:val="1"/>
+        </w:numPr>
+      </w:pPr>
+      <w:proofErr w:type="spellStart"/>
+      <w:r>
+        <w:lastRenderedPageBreak/>
+        <w:t>Enabling</w:t>
+      </w:r>
+      <w:proofErr w:type="spellEnd"/>
+      <w:r>
+        <w:t xml:space="preserve"> </w:t>
+      </w:r>
+      <w:proofErr w:type="spellStart"/>
+      <w:r>
+        <w:t>static</w:t>
+      </w:r>
+      <w:proofErr w:type="spellEnd"/>
+      <w:r>
+        <w:t xml:space="preserve"> </w:t>
+      </w:r>
+      <w:proofErr w:type="spellStart"/>
+      <w:r>
+        <w:t>website</w:t>
+      </w:r>
+      <w:proofErr w:type="spellEnd"/>
+      <w:r>
+        <w:t xml:space="preserve"> hosting</w:t>
+      </w:r>
+    </w:p>
+    <w:p>
+      <w:pPr>
+        <w:ind w:left="360"/>
+      </w:pPr>
+      <w:r>
+        <w:drawing>
+          <wp:inline distT="0" distB="0" distL="0" distR="0" wp14:anchorId="4FBA40AC" wp14:editId="6B7F0921">
+            <wp:extent cx="5760720" cy="3766185"/>
+            <wp:effectExtent l="0" t="0" r="0" b="5715"/>
+            <wp:docPr id="1459706379" name="Obraz 1"/>
+            <wp:cNvGraphicFramePr>
+              <a:graphicFrameLocks xmlns:a="http://schemas.openxmlformats.org/drawingml/2006/main" noChangeAspect="1"/>
+            </wp:cNvGraphicFramePr>
+            <a:graphic xmlns:a="http://schemas.openxmlformats.org/drawingml/2006/main">
+              <a:graphicData uri="http://schemas.openxmlformats.org/drawingml/2006/picture">
+                <pic:pic xmlns:pic="http://schemas.openxmlformats.org/drawingml/2006/picture">
+                  <pic:nvPicPr>
+                    <pic:cNvPr id="1459706379" name=""/>
+                    <pic:cNvPicPr/>
+                  </pic:nvPicPr>
+                  <pic:blipFill>
+                    <a:blip r:embed="rId9"/>
+                    <a:stretch>
+                      <a:fillRect/>
+                    </a:stretch>
+                  </pic:blipFill>
+                  <pic:spPr>
+                    <a:xfrm>
+                      <a:off x="0" y="0"/>
+                      <a:ext cx="5760720" cy="3766185"/>
+                    </a:xfrm>
+                    <a:prstGeom prst="rect">
+                      <a:avLst/>
+                    </a:prstGeom>
+                  </pic:spPr>
+                </pic:pic>
+              </a:graphicData>
+            </a:graphic>
+          </wp:inline>
+        </w:drawing>
+      </w:r>
+    </w:p>
+    <w:p>
+      <w:pPr>
+        <w:pStyle w:val="Akapitzlist"/>
+        <w:numPr>
+          <w:ilvl w:val="0"/>
+          <w:numId w:val="1"/>
+        </w:numPr>
+      </w:pPr>
+      <w:proofErr w:type="spellStart"/>
+      <w:r>
+        <w:t>Creating</w:t>
+      </w:r>
+      <w:proofErr w:type="spellEnd"/>
+      <w:r>
+        <w:t xml:space="preserve"> </w:t>
+      </w:r>
+      <w:proofErr w:type="spellStart"/>
+      <w:r>
+        <w:t>CloudFront</w:t>
+      </w:r>
+      <w:proofErr w:type="spellEnd"/>
+      <w:r>
+        <w:t xml:space="preserve"> </w:t>
+      </w:r>
+      <w:proofErr w:type="spellStart"/>
+      <w:r>
+        <w:t>distribution</w:t>
+      </w:r>
+      <w:proofErr w:type="spellEnd"/>
+    </w:p>
+    <w:p>
+      <w:pPr>
+        <w:ind w:left="360"/>
+      </w:pPr>
+      <w:r>
+        <w:drawing>
+          <wp:inline distT="0" distB="0" distL="0" distR="0" wp14:anchorId="1F2A8F72" wp14:editId="1F0B53F2">
+            <wp:extent cx="5760720" cy="3469005"/>
+            <wp:effectExtent l="0" t="0" r="0" b="0"/>
+            <wp:docPr id="46998037" name="Obraz 1"/>
+            <wp:cNvGraphicFramePr>
+              <a:graphicFrameLocks xmlns:a="http://schemas.openxmlformats.org/drawingml/2006/main" noChangeAspect="1"/>
+            </wp:cNvGraphicFramePr>
+            <a:graphic xmlns:a="http://schemas.openxmlformats.org/drawingml/2006/main">
+              <a:graphicData uri="http://schemas.openxmlformats.org/drawingml/2006/picture">
+                <pic:pic xmlns:pic="http://schemas.openxmlformats.org/drawingml/2006/picture">
+                  <pic:nvPicPr>
+                    <pic:cNvPr id="46998037" name=""/>
+                    <pic:cNvPicPr/>
+                  </pic:nvPicPr>
+                  <pic:blipFill>
+                    <a:blip r:embed="rId10"/>
+                    <a:stretch>
+                      <a:fillRect/>
+                    </a:stretch>
+                  </pic:blipFill>
+                  <pic:spPr>
+                    <a:xfrm>
+                      <a:off x="0" y="0"/>
+                      <a:ext cx="5760720" cy="3469005"/>
+                    </a:xfrm>
+                    <a:prstGeom prst="rect">
+                      <a:avLst/>
+                    </a:prstGeom>
+                  </pic:spPr>
+                </pic:pic>
+              </a:graphicData>
+            </a:graphic>
+          </wp:inline>
+        </w:drawing>
+      </w:r>
+    </w:p>
+    <w:p>
+      <w:pPr>
+        <w:ind w:left="360"/>
+      </w:pPr>
+    </w:p>
+    <w:p>
+      <w:pPr>
+        <w:ind w:left="360"/>
+      </w:pPr>
+    </w:p>
+    <w:p>
+      <w:pPr>
+        <w:pStyle w:val="Akapitzlist"/>
+        <w:numPr>
+          <w:ilvl w:val="0"/>
+          <w:numId w:val="1"/>
+        </w:numPr>
+      </w:pPr>
+      <w:r>
+        <w:lastRenderedPageBreak/>
+        <w:t xml:space="preserve">Distribution </w:t>
+      </w:r>
+      <w:proofErr w:type="spellStart"/>
+      <w:r>
+        <w:t>deployed</w:t>
+      </w:r>
+      <w:proofErr w:type="spellEnd"/>
+    </w:p>
+    <w:p>
+      <w:pPr>
+        <w:ind w:left="360"/>
+      </w:pPr>
+      <w:r>
+        <w:drawing>
+          <wp:inline distT="0" distB="0" distL="0" distR="0" wp14:anchorId="1923F181" wp14:editId="3E2FD209">
+            <wp:extent cx="5760720" cy="2205990"/>
+            <wp:effectExtent l="0" t="0" r="0" b="3810"/>
+            <wp:docPr id="1406136283" name="Obraz 1"/>
+            <wp:cNvGraphicFramePr>
+              <a:graphicFrameLocks xmlns:a="http://schemas.openxmlformats.org/drawingml/2006/main" noChangeAspect="1"/>
+            </wp:cNvGraphicFramePr>
+            <a:graphic xmlns:a="http://schemas.openxmlformats.org/drawingml/2006/main">
+              <a:graphicData uri="http://schemas.openxmlformats.org/drawingml/2006/picture">
+                <pic:pic xmlns:pic="http://schemas.openxmlformats.org/drawingml/2006/picture">
+                  <pic:nvPicPr>
+                    <pic:cNvPr id="1406136283" name=""/>
+                    <pic:cNvPicPr/>
+                  </pic:nvPicPr>
+                  <pic:blipFill>
+                    <a:blip r:embed="rId11"/>
+                    <a:stretch>
+                      <a:fillRect/>
+                    </a:stretch>
+                  </pic:blipFill>
+                  <pic:spPr>
+                    <a:xfrm>
+                      <a:off x="0" y="0"/>
+                      <a:ext cx="5760720" cy="2205990"/>
+                    </a:xfrm>
+                    <a:prstGeom prst="rect">
+                      <a:avLst/>
+                    </a:prstGeom>
+                  </pic:spPr>
+                </pic:pic>
+              </a:graphicData>
+            </a:graphic>
+          </wp:inline>
+        </w:drawing>
+      </w:r>
+    </w:p>
+    <w:p>
+      <w:pPr>
+        <w:pStyle w:val="Akapitzlist"/>
+        <w:numPr>
+          <w:ilvl w:val="0"/>
+          <w:numId w:val="1"/>
+        </w:numPr>
+      </w:pPr>
+      <w:proofErr w:type="spellStart"/>
+      <w:r>
+        <w:t>Checking</w:t>
+      </w:r>
+      <w:proofErr w:type="spellEnd"/>
+      <w:r>
+        <w:t xml:space="preserve"> </w:t>
+      </w:r>
+      <w:proofErr w:type="spellStart"/>
+      <w:r>
+        <w:t>access</w:t>
+      </w:r>
+      <w:proofErr w:type="spellEnd"/>
+    </w:p>
+    <w:p>
+      <w:pPr>
+        <w:ind w:left="360"/>
+      </w:pPr>
+      <w:r>
+        <w:drawing>
+          <wp:inline distT="0" distB="0" distL="0" distR="0" wp14:anchorId="46417ADE" wp14:editId="38A71285">
+            <wp:extent cx="5760720" cy="2423160"/>
+            <wp:effectExtent l="0" t="0" r="0" b="0"/>
+            <wp:docPr id="941853383" name="Obraz 1"/>
+            <wp:cNvGraphicFramePr>
+              <a:graphicFrameLocks xmlns:a="http://schemas.openxmlformats.org/drawingml/2006/main" noChangeAspect="1"/>
+            </wp:cNvGraphicFramePr>
+            <a:graphic xmlns:a="http://schemas.openxmlformats.org/drawingml/2006/main">
+              <a:graphicData uri="http://schemas.openxmlformats.org/drawingml/2006/picture">
+                <pic:pic xmlns:pic="http://schemas.openxmlformats.org/drawingml/2006/picture">
+                  <pic:nvPicPr>
+                    <pic:cNvPr id="941853383" name=""/>
+                    <pic:cNvPicPr/>
+                  </pic:nvPicPr>
+                  <pic:blipFill>
+                    <a:blip r:embed="rId12"/>
+                    <a:stretch>
+                      <a:fillRect/>
+                    </a:stretch>
+                  </pic:blipFill>
+                  <pic:spPr>
+                    <a:xfrm>
+                      <a:off x="0" y="0"/>
+                      <a:ext cx="5760720" cy="2423160"/>
+                    </a:xfrm>
+                    <a:prstGeom prst="rect">
+                      <a:avLst/>
+                    </a:prstGeom>
+                  </pic:spPr>
+                </pic:pic>
+              </a:graphicData>
+            </a:graphic>
+          </wp:inline>
+        </w:drawing>
+      </w:r>
+    </w:p>
+    <w:p>
+      <w:pPr>
+        <w:ind w:left="360"/>
+      </w:pPr>
+      <w:proofErr w:type="spellStart"/>
+      <w:r>
+        <w:t>Answer</w:t>
+      </w:r>
+      <w:proofErr w:type="spellEnd"/>
+      <w:r>
+        <w:t xml:space="preserve"> to </w:t>
+      </w:r>
+      <w:proofErr w:type="spellStart"/>
+      <w:r>
+        <w:t>questions</w:t>
+      </w:r>
+      <w:proofErr w:type="spellEnd"/>
+      <w:r>
+        <w:t>:</w:t>
+      </w:r>
+    </w:p>
+    <w:p>
+      <w:pPr>
+        <w:pStyle w:val="Akapitzlist"/>
+        <w:numPr>
+          <w:ilvl w:val="0"/>
+          <w:numId w:val="2"/>
+        </w:numPr>
+      </w:pPr>
+      <w:r>
+        <w:t xml:space="preserve">How </w:t>
+      </w:r>
+      <w:proofErr w:type="spellStart"/>
+      <w:r>
+        <w:t>you</w:t>
+      </w:r>
+      <w:proofErr w:type="spellEnd"/>
+      <w:r>
+        <w:t xml:space="preserve"> </w:t>
+      </w:r>
+      <w:proofErr w:type="spellStart"/>
+      <w:r>
+        <w:t>would</w:t>
+      </w:r>
+      <w:proofErr w:type="spellEnd"/>
+      <w:r>
+        <w:t xml:space="preserve"> </w:t>
+      </w:r>
+      <w:proofErr w:type="spellStart"/>
+      <w:r>
+        <w:t>Configure</w:t>
+      </w:r>
+      <w:proofErr w:type="spellEnd"/>
+      <w:r>
+        <w:t xml:space="preserve"> </w:t>
+      </w:r>
+      <w:proofErr w:type="spellStart"/>
+      <w:r>
+        <w:t>ownership</w:t>
+      </w:r>
+      <w:proofErr w:type="spellEnd"/>
+      <w:r>
+        <w:t xml:space="preserve"> of </w:t>
+      </w:r>
+      <w:proofErr w:type="spellStart"/>
+      <w:r>
+        <w:t>your</w:t>
+      </w:r>
+      <w:proofErr w:type="spellEnd"/>
+      <w:r>
+        <w:t xml:space="preserve"> </w:t>
+      </w:r>
+      <w:proofErr w:type="spellStart"/>
+      <w:r>
+        <w:t>own</w:t>
+      </w:r>
+      <w:proofErr w:type="spellEnd"/>
+      <w:r>
+        <w:t xml:space="preserve"> </w:t>
+      </w:r>
+      <w:proofErr w:type="spellStart"/>
+      <w:r>
+        <w:t>domain</w:t>
+      </w:r>
+      <w:proofErr w:type="spellEnd"/>
+      <w:r>
+        <w:t xml:space="preserve"> in AWS</w:t>
+      </w:r>
+      <w:r>
+        <w:t>?</w:t>
+      </w:r>
+    </w:p>
+    <w:p>
+      <w:pPr>
+        <w:pStyle w:val="Akapitzlist"/>
+      </w:pPr>
+    </w:p>
+    <w:p>
+      <w:pPr>
+        <w:pStyle w:val="Akapitzlist"/>
+      </w:pPr>
+      <w:r>
+        <w:t xml:space="preserve">I </w:t>
+      </w:r>
+      <w:proofErr w:type="spellStart"/>
+      <w:r>
+        <w:t>would</w:t>
+      </w:r>
+      <w:proofErr w:type="spellEnd"/>
+      <w:r>
+        <w:t xml:space="preserve"> </w:t>
+      </w:r>
+      <w:proofErr w:type="spellStart"/>
+      <w:r>
+        <w:t>use</w:t>
+      </w:r>
+      <w:proofErr w:type="spellEnd"/>
+      <w:r>
+        <w:t xml:space="preserve"> </w:t>
+      </w:r>
+      <w:proofErr w:type="spellStart"/>
+      <w:r>
+        <w:t>Route</w:t>
+      </w:r>
+      <w:proofErr w:type="spellEnd"/>
+      <w:r>
+        <w:t xml:space="preserve"> 53 service. </w:t>
+      </w:r>
+      <w:proofErr w:type="spellStart"/>
+      <w:r>
+        <w:t>I’d</w:t>
+      </w:r>
+      <w:proofErr w:type="spellEnd"/>
+      <w:r>
+        <w:t xml:space="preserve"> register the </w:t>
+      </w:r>
+      <w:proofErr w:type="spellStart"/>
+      <w:r>
+        <w:t>domain</w:t>
+      </w:r>
+      <w:proofErr w:type="spellEnd"/>
+      <w:r>
+        <w:t xml:space="preserve"> </w:t>
+      </w:r>
+      <w:proofErr w:type="spellStart"/>
+      <w:r>
+        <w:t>directly</w:t>
+      </w:r>
+      <w:proofErr w:type="spellEnd"/>
+      <w:r>
+        <w:t xml:space="preserve"> in </w:t>
+      </w:r>
+      <w:proofErr w:type="spellStart"/>
+      <w:r>
+        <w:t>that</w:t>
+      </w:r>
+      <w:proofErr w:type="spellEnd"/>
+      <w:r>
+        <w:t xml:space="preserve"> service </w:t>
+      </w:r>
+      <w:proofErr w:type="spellStart"/>
+      <w:r>
+        <w:t>or</w:t>
+      </w:r>
+      <w:proofErr w:type="spellEnd"/>
+      <w:r>
+        <w:t xml:space="preserve"> </w:t>
+      </w:r>
+      <w:proofErr w:type="spellStart"/>
+      <w:r>
+        <w:t>if</w:t>
+      </w:r>
+      <w:proofErr w:type="spellEnd"/>
+      <w:r>
+        <w:t xml:space="preserve"> the </w:t>
+      </w:r>
+      <w:proofErr w:type="spellStart"/>
+      <w:r>
+        <w:t>domain</w:t>
+      </w:r>
+      <w:proofErr w:type="spellEnd"/>
+      <w:r>
+        <w:t xml:space="preserve"> </w:t>
+      </w:r>
+      <w:proofErr w:type="spellStart"/>
+      <w:r>
+        <w:t>is</w:t>
+      </w:r>
+      <w:proofErr w:type="spellEnd"/>
+      <w:r>
+        <w:t xml:space="preserve"> </w:t>
+      </w:r>
+      <w:proofErr w:type="spellStart"/>
+      <w:r>
+        <w:t>already</w:t>
+      </w:r>
+      <w:proofErr w:type="spellEnd"/>
+      <w:r>
+        <w:t xml:space="preserve"> </w:t>
+      </w:r>
+      <w:proofErr w:type="spellStart"/>
+      <w:r>
+        <w:t>registered</w:t>
+      </w:r>
+      <w:proofErr w:type="spellEnd"/>
+      <w:r>
+        <w:t xml:space="preserve"> </w:t>
+      </w:r>
+      <w:proofErr w:type="spellStart"/>
+      <w:r>
+        <w:t>somewhere</w:t>
+      </w:r>
+      <w:proofErr w:type="spellEnd"/>
+      <w:r>
+        <w:t xml:space="preserve"> </w:t>
+      </w:r>
+      <w:proofErr w:type="spellStart"/>
+      <w:r>
+        <w:t>else</w:t>
+      </w:r>
+      <w:proofErr w:type="spellEnd"/>
+      <w:r>
+        <w:t xml:space="preserve">, I </w:t>
+      </w:r>
+      <w:proofErr w:type="spellStart"/>
+      <w:r>
+        <w:t>would</w:t>
+      </w:r>
+      <w:proofErr w:type="spellEnd"/>
+      <w:r>
+        <w:t xml:space="preserve"> update the </w:t>
+      </w:r>
+      <w:proofErr w:type="spellStart"/>
+      <w:r>
+        <w:t>domain</w:t>
+      </w:r>
+      <w:proofErr w:type="spellEnd"/>
+      <w:r>
+        <w:t xml:space="preserve"> </w:t>
+      </w:r>
+      <w:proofErr w:type="spellStart"/>
+      <w:r>
+        <w:t>nameservers</w:t>
+      </w:r>
+      <w:proofErr w:type="spellEnd"/>
+      <w:r>
+        <w:t xml:space="preserve"> to point to </w:t>
+      </w:r>
+      <w:proofErr w:type="spellStart"/>
+      <w:r>
+        <w:t>Route</w:t>
+      </w:r>
+      <w:proofErr w:type="spellEnd"/>
+      <w:r>
+        <w:t xml:space="preserve"> 53 </w:t>
+      </w:r>
+      <w:proofErr w:type="spellStart"/>
+      <w:r>
+        <w:t>hosted</w:t>
+      </w:r>
+      <w:proofErr w:type="spellEnd"/>
+      <w:r>
+        <w:t xml:space="preserve"> </w:t>
+      </w:r>
+      <w:proofErr w:type="spellStart"/>
+      <w:r>
+        <w:t>zone</w:t>
+      </w:r>
+      <w:proofErr w:type="spellEnd"/>
+      <w:r>
+        <w:t>.</w:t>
+      </w:r>
+    </w:p>
+    <w:p>
+      <w:pPr>
+        <w:pStyle w:val="Akapitzlist"/>
+      </w:pPr>
+    </w:p>
+    <w:p>
+      <w:pPr>
+        <w:pStyle w:val="Akapitzlist"/>
+        <w:numPr>
+          <w:ilvl w:val="0"/>
+          <w:numId w:val="2"/>
+        </w:numPr>
+      </w:pPr>
+      <w:r>
+        <w:t>H</w:t>
+      </w:r>
+      <w:r>
+        <w:t xml:space="preserve">ow </w:t>
+      </w:r>
+      <w:proofErr w:type="spellStart"/>
+      <w:r>
+        <w:t>you</w:t>
+      </w:r>
+      <w:proofErr w:type="spellEnd"/>
+      <w:r>
+        <w:t xml:space="preserve"> </w:t>
+      </w:r>
+      <w:proofErr w:type="spellStart"/>
+      <w:r>
+        <w:t>would</w:t>
+      </w:r>
+      <w:proofErr w:type="spellEnd"/>
+      <w:r>
+        <w:t xml:space="preserve"> </w:t>
+      </w:r>
+      <w:proofErr w:type="spellStart"/>
+      <w:r>
+        <w:t>Redirect</w:t>
+      </w:r>
+      <w:proofErr w:type="spellEnd"/>
+      <w:r>
+        <w:t xml:space="preserve"> </w:t>
+      </w:r>
+      <w:proofErr w:type="spellStart"/>
+      <w:r>
+        <w:t>your</w:t>
+      </w:r>
+      <w:proofErr w:type="spellEnd"/>
+      <w:r>
+        <w:t xml:space="preserve"> </w:t>
+      </w:r>
+      <w:proofErr w:type="spellStart"/>
+      <w:r>
+        <w:t>domain</w:t>
+      </w:r>
+      <w:proofErr w:type="spellEnd"/>
+      <w:r>
+        <w:t xml:space="preserve"> </w:t>
+      </w:r>
+      <w:proofErr w:type="spellStart"/>
+      <w:r>
+        <w:t>name</w:t>
+      </w:r>
+      <w:proofErr w:type="spellEnd"/>
+      <w:r>
+        <w:t xml:space="preserve"> to the </w:t>
+      </w:r>
+      <w:proofErr w:type="spellStart"/>
+      <w:r>
+        <w:t>Cloudfront</w:t>
+      </w:r>
+      <w:proofErr w:type="spellEnd"/>
+      <w:r>
+        <w:t xml:space="preserve"> </w:t>
+      </w:r>
+      <w:proofErr w:type="spellStart"/>
+      <w:r>
+        <w:t>address</w:t>
+      </w:r>
+      <w:proofErr w:type="spellEnd"/>
+      <w:r>
+        <w:t xml:space="preserve"> </w:t>
+      </w:r>
+      <w:proofErr w:type="spellStart"/>
+      <w:r>
+        <w:t>where</w:t>
+      </w:r>
+      <w:proofErr w:type="spellEnd"/>
+      <w:r>
+        <w:t xml:space="preserve"> the </w:t>
+      </w:r>
+      <w:proofErr w:type="spellStart"/>
+      <w:r>
+        <w:t>website</w:t>
+      </w:r>
+      <w:proofErr w:type="spellEnd"/>
+      <w:r>
+        <w:t xml:space="preserve"> </w:t>
+      </w:r>
+      <w:proofErr w:type="spellStart"/>
+      <w:r>
+        <w:t>exists</w:t>
+      </w:r>
+      <w:proofErr w:type="spellEnd"/>
+      <w:r>
+        <w:t xml:space="preserve">. </w:t>
+      </w:r>
+      <w:proofErr w:type="spellStart"/>
+      <w:r>
+        <w:t>So</w:t>
+      </w:r>
+      <w:proofErr w:type="spellEnd"/>
+      <w:r>
+        <w:t xml:space="preserve"> </w:t>
+      </w:r>
+      <w:proofErr w:type="spellStart"/>
+      <w:r>
+        <w:t>that</w:t>
+      </w:r>
+      <w:proofErr w:type="spellEnd"/>
+      <w:r>
+        <w:t xml:space="preserve"> </w:t>
+      </w:r>
+      <w:proofErr w:type="spellStart"/>
+      <w:r>
+        <w:t>users</w:t>
+      </w:r>
+      <w:proofErr w:type="spellEnd"/>
+      <w:r>
+        <w:t xml:space="preserve"> </w:t>
+      </w:r>
+      <w:proofErr w:type="spellStart"/>
+      <w:r>
+        <w:t>can</w:t>
+      </w:r>
+      <w:proofErr w:type="spellEnd"/>
+      <w:r>
+        <w:t xml:space="preserve"> </w:t>
+      </w:r>
+      <w:proofErr w:type="spellStart"/>
+      <w:r>
+        <w:t>visit</w:t>
+      </w:r>
+      <w:proofErr w:type="spellEnd"/>
+      <w:r>
+        <w:t xml:space="preserve"> the </w:t>
+      </w:r>
+      <w:proofErr w:type="spellStart"/>
+      <w:r>
+        <w:t>website</w:t>
+      </w:r>
+      <w:proofErr w:type="spellEnd"/>
+      <w:r>
+        <w:t xml:space="preserve"> </w:t>
+      </w:r>
+      <w:proofErr w:type="spellStart"/>
+      <w:r>
+        <w:t>through</w:t>
+      </w:r>
+      <w:proofErr w:type="spellEnd"/>
+      <w:r>
+        <w:t xml:space="preserve"> a </w:t>
+      </w:r>
+      <w:proofErr w:type="spellStart"/>
+      <w:r>
+        <w:t>custom</w:t>
+      </w:r>
+      <w:proofErr w:type="spellEnd"/>
+      <w:r>
+        <w:t xml:space="preserve"> </w:t>
+      </w:r>
+      <w:proofErr w:type="spellStart"/>
+      <w:r>
+        <w:t>address</w:t>
+      </w:r>
+      <w:proofErr w:type="spellEnd"/>
+      <w:r>
+        <w:t>.</w:t>
+      </w:r>
+    </w:p>
+    <w:p>
+      <w:pPr>
+        <w:pStyle w:val="Akapitzlist"/>
+      </w:pPr>
+    </w:p>
+    <w:p>
+      <w:pPr>
+        <w:pStyle w:val="Akapitzlist"/>
+      </w:pPr>
+      <w:r>
+        <w:t xml:space="preserve">I </w:t>
+      </w:r>
+      <w:proofErr w:type="spellStart"/>
+      <w:r>
+        <w:t>would</w:t>
+      </w:r>
+      <w:proofErr w:type="spellEnd"/>
+      <w:r>
+        <w:t xml:space="preserve"> </w:t>
+      </w:r>
+      <w:proofErr w:type="spellStart"/>
+      <w:r>
+        <w:t>also</w:t>
+      </w:r>
+      <w:proofErr w:type="spellEnd"/>
+      <w:r>
+        <w:t xml:space="preserve"> </w:t>
+      </w:r>
+      <w:proofErr w:type="spellStart"/>
+      <w:r>
+        <w:t>use</w:t>
+      </w:r>
+      <w:proofErr w:type="spellEnd"/>
+      <w:r>
+        <w:t xml:space="preserve"> Route53 in </w:t>
+      </w:r>
+      <w:proofErr w:type="spellStart"/>
+      <w:r>
+        <w:t>which</w:t>
+      </w:r>
+      <w:proofErr w:type="spellEnd"/>
+      <w:r>
+        <w:t xml:space="preserve"> i </w:t>
+      </w:r>
+      <w:proofErr w:type="spellStart"/>
+      <w:r>
+        <w:t>would</w:t>
+      </w:r>
+      <w:proofErr w:type="spellEnd"/>
+      <w:r>
+        <w:t xml:space="preserve"> </w:t>
+      </w:r>
+      <w:proofErr w:type="spellStart"/>
+      <w:r>
+        <w:t>create</w:t>
+      </w:r>
+      <w:proofErr w:type="spellEnd"/>
+      <w:r>
+        <w:t xml:space="preserve"> </w:t>
+      </w:r>
+      <w:proofErr w:type="spellStart"/>
+      <w:r>
+        <w:t>an</w:t>
+      </w:r>
+      <w:proofErr w:type="spellEnd"/>
+      <w:r>
+        <w:t xml:space="preserve"> ALIAS </w:t>
+      </w:r>
+      <w:proofErr w:type="spellStart"/>
+      <w:r>
+        <w:t>record</w:t>
+      </w:r>
+      <w:proofErr w:type="spellEnd"/>
+      <w:r>
+        <w:t xml:space="preserve"> </w:t>
+      </w:r>
+      <w:proofErr w:type="spellStart"/>
+      <w:r>
+        <w:t>pointing</w:t>
+      </w:r>
+      <w:proofErr w:type="spellEnd"/>
+      <w:r>
+        <w:t xml:space="preserve"> my </w:t>
+      </w:r>
+      <w:proofErr w:type="spellStart"/>
+      <w:r>
+        <w:t>domain</w:t>
+      </w:r>
+      <w:proofErr w:type="spellEnd"/>
+      <w:r>
+        <w:t xml:space="preserve"> to the </w:t>
+      </w:r>
+      <w:proofErr w:type="spellStart"/>
+      <w:r>
+        <w:t>CloudFront</w:t>
+      </w:r>
+      <w:proofErr w:type="spellEnd"/>
+      <w:r>
+        <w:t xml:space="preserve"> </w:t>
+      </w:r>
+      <w:proofErr w:type="spellStart"/>
+      <w:r>
+        <w:t>distribution</w:t>
+      </w:r>
+      <w:proofErr w:type="spellEnd"/>
+      <w:r>
+        <w:t xml:space="preserve"> </w:t>
+      </w:r>
+      <w:proofErr w:type="spellStart"/>
+      <w:r>
+        <w:t>domain</w:t>
+      </w:r>
+      <w:proofErr w:type="spellEnd"/>
+      <w:r>
+        <w:t xml:space="preserve"> </w:t>
+      </w:r>
+      <w:proofErr w:type="spellStart"/>
+      <w:r>
+        <w:t>name</w:t>
+      </w:r>
+      <w:proofErr w:type="spellEnd"/>
+      <w:r>
+        <w:t>.</w:t>
+      </w:r>
+    </w:p>
+    <w:p>
+      <w:pPr>
+        <w:pStyle w:val="Akapitzlist"/>
+      </w:pPr>
+    </w:p>
     <w:p/>
     <w:sectPr>
       <w:pgSz w:w="11906" w:h="16838"/>
@@ -11,6 +1163,195 @@
     </w:sectPr>
   </w:body>
 </w:document>
+</file>
+
+<file path=word/numbering.xml><?xml version="1.0" encoding="utf-8"?>
+<w:numbering xmlns:wpc="http://schemas.microsoft.com/office/word/2010/wordprocessingCanvas" xmlns:cx="http://schemas.microsoft.com/office/drawing/2014/chartex" xmlns:cx1="http://schemas.microsoft.com/office/drawing/2015/9/8/chartex" xmlns:cx2="http://schemas.microsoft.com/office/drawing/2015/10/21/chartex" xmlns:cx3="http://schemas.microsoft.com/office/drawing/2016/5/9/chartex" xmlns:cx4="http://schemas.microsoft.com/office/drawing/2016/5/10/chartex" xmlns:cx5="http://schemas.microsoft.com/office/drawing/2016/5/11/chartex" xmlns:cx6="http://schemas.microsoft.com/office/drawing/2016/5/12/chartex" xmlns:cx7="http://schemas.microsoft.com/office/drawing/2016/5/13/chartex" xmlns:cx8="http://schemas.microsoft.com/office/drawing/2016/5/14/chartex" xmlns:mc="http://schemas.openxmlformats.org/markup-compatibility/2006" xmlns:aink="http://schemas.microsoft.com/office/drawing/2016/ink" xmlns:am3d="http://schemas.microsoft.com/office/drawing/2017/model3d" xmlns:o="urn:schemas-microsoft-com:office:office" xmlns:oel="http://schemas.microsoft.com/office/2019/extlst" xmlns:r="http://schemas.openxmlformats.org/officeDocument/2006/relationships" xmlns:m="http://schemas.openxmlformats.org/officeDocument/2006/math" xmlns:v="urn:schemas-microsoft-com:vml" xmlns:wp14="http://schemas.microsoft.com/office/word/2010/wordprocessingDrawing" xmlns:wp="http://schemas.openxmlformats.org/drawingml/2006/wordprocessingDrawing" xmlns:w10="urn:schemas-microsoft-com:office:word" xmlns:w="http://schemas.openxmlformats.org/wordprocessingml/2006/main" xmlns:w14="http://schemas.microsoft.com/office/word/2010/wordml" xmlns:w15="http://schemas.microsoft.com/office/word/2012/wordml" xmlns:w16cex="http://schemas.microsoft.com/office/word/2018/wordml/cex" xmlns:w16cid="http://schemas.microsoft.com/office/word/2016/wordml/cid" xmlns:w16="http://schemas.microsoft.com/office/word/2018/wordml" xmlns:w16du="http://schemas.microsoft.com/office/word/2023/wordml/word16du" xmlns:w16sdtdh="http://schemas.microsoft.com/office/word/2020/wordml/sdtdatahash" xmlns:w16sdtfl="http://schemas.microsoft.com/office/word/2024/wordml/sdtformatlock" xmlns:w16se="http://schemas.microsoft.com/office/word/2015/wordml/symex" xmlns:wpg="http://schemas.microsoft.com/office/word/2010/wordprocessingGroup" xmlns:wpi="http://schemas.microsoft.com/office/word/2010/wordprocessingInk" xmlns:wne="http://schemas.microsoft.com/office/word/2006/wordml" xmlns:wps="http://schemas.microsoft.com/office/word/2010/wordprocessingShape" mc:Ignorable="w14 w15 w16se w16cid w16 w16cex w16sdtdh w16sdtfl w16du wp14">
+  <w:abstractNum w:abstractNumId="0" w15:restartNumberingAfterBreak="0">
+    <w:nsid w:val="17CA682F"/>
+    <w:multiLevelType w:val="hybridMultilevel"/>
+    <w:tmpl w:val="E13EB85C"/>
+    <w:lvl w:ilvl="0" w:tplc="04150019">
+      <w:start w:val="1"/>
+      <w:numFmt w:val="lowerLetter"/>
+      <w:lvlText w:val="%1."/>
+      <w:lvlJc w:val="left"/>
+      <w:pPr>
+        <w:ind w:left="720" w:hanging="360"/>
+      </w:pPr>
+      <w:rPr>
+        <w:rFonts w:hint="default"/>
+      </w:rPr>
+    </w:lvl>
+    <w:lvl w:ilvl="1" w:tplc="04150019" w:tentative="1">
+      <w:start w:val="1"/>
+      <w:numFmt w:val="lowerLetter"/>
+      <w:lvlText w:val="%2."/>
+      <w:lvlJc w:val="left"/>
+      <w:pPr>
+        <w:ind w:left="1440" w:hanging="360"/>
+      </w:pPr>
+    </w:lvl>
+    <w:lvl w:ilvl="2" w:tplc="0415001B" w:tentative="1">
+      <w:start w:val="1"/>
+      <w:numFmt w:val="lowerRoman"/>
+      <w:lvlText w:val="%3."/>
+      <w:lvlJc w:val="right"/>
+      <w:pPr>
+        <w:ind w:left="2160" w:hanging="180"/>
+      </w:pPr>
+    </w:lvl>
+    <w:lvl w:ilvl="3" w:tplc="0415000F" w:tentative="1">
+      <w:start w:val="1"/>
+      <w:numFmt w:val="decimal"/>
+      <w:lvlText w:val="%4."/>
+      <w:lvlJc w:val="left"/>
+      <w:pPr>
+        <w:ind w:left="2880" w:hanging="360"/>
+      </w:pPr>
+    </w:lvl>
+    <w:lvl w:ilvl="4" w:tplc="04150019" w:tentative="1">
+      <w:start w:val="1"/>
+      <w:numFmt w:val="lowerLetter"/>
+      <w:lvlText w:val="%5."/>
+      <w:lvlJc w:val="left"/>
+      <w:pPr>
+        <w:ind w:left="3600" w:hanging="360"/>
+      </w:pPr>
+    </w:lvl>
+    <w:lvl w:ilvl="5" w:tplc="0415001B" w:tentative="1">
+      <w:start w:val="1"/>
+      <w:numFmt w:val="lowerRoman"/>
+      <w:lvlText w:val="%6."/>
+      <w:lvlJc w:val="right"/>
+      <w:pPr>
+        <w:ind w:left="4320" w:hanging="180"/>
+      </w:pPr>
+    </w:lvl>
+    <w:lvl w:ilvl="6" w:tplc="0415000F" w:tentative="1">
+      <w:start w:val="1"/>
+      <w:numFmt w:val="decimal"/>
+      <w:lvlText w:val="%7."/>
+      <w:lvlJc w:val="left"/>
+      <w:pPr>
+        <w:ind w:left="5040" w:hanging="360"/>
+      </w:pPr>
+    </w:lvl>
+    <w:lvl w:ilvl="7" w:tplc="04150019" w:tentative="1">
+      <w:start w:val="1"/>
+      <w:numFmt w:val="lowerLetter"/>
+      <w:lvlText w:val="%8."/>
+      <w:lvlJc w:val="left"/>
+      <w:pPr>
+        <w:ind w:left="5760" w:hanging="360"/>
+      </w:pPr>
+    </w:lvl>
+    <w:lvl w:ilvl="8" w:tplc="0415001B" w:tentative="1">
+      <w:start w:val="1"/>
+      <w:numFmt w:val="lowerRoman"/>
+      <w:lvlText w:val="%9."/>
+      <w:lvlJc w:val="right"/>
+      <w:pPr>
+        <w:ind w:left="6480" w:hanging="180"/>
+      </w:pPr>
+    </w:lvl>
+  </w:abstractNum>
+  <w:abstractNum w:abstractNumId="1" w15:restartNumberingAfterBreak="0">
+    <w:nsid w:val="30683C00"/>
+    <w:multiLevelType w:val="hybridMultilevel"/>
+    <w:tmpl w:val="CCC4089A"/>
+    <w:lvl w:ilvl="0" w:tplc="0415000F">
+      <w:start w:val="1"/>
+      <w:numFmt w:val="decimal"/>
+      <w:lvlText w:val="%1."/>
+      <w:lvlJc w:val="left"/>
+      <w:pPr>
+        <w:ind w:left="720" w:hanging="360"/>
+      </w:pPr>
+      <w:rPr>
+        <w:rFonts w:hint="default"/>
+      </w:rPr>
+    </w:lvl>
+    <w:lvl w:ilvl="1" w:tplc="04150019" w:tentative="1">
+      <w:start w:val="1"/>
+      <w:numFmt w:val="lowerLetter"/>
+      <w:lvlText w:val="%2."/>
+      <w:lvlJc w:val="left"/>
+      <w:pPr>
+        <w:ind w:left="1440" w:hanging="360"/>
+      </w:pPr>
+    </w:lvl>
+    <w:lvl w:ilvl="2" w:tplc="0415001B" w:tentative="1">
+      <w:start w:val="1"/>
+      <w:numFmt w:val="lowerRoman"/>
+      <w:lvlText w:val="%3."/>
+      <w:lvlJc w:val="right"/>
+      <w:pPr>
+        <w:ind w:left="2160" w:hanging="180"/>
+      </w:pPr>
+    </w:lvl>
+    <w:lvl w:ilvl="3" w:tplc="0415000F" w:tentative="1">
+      <w:start w:val="1"/>
+      <w:numFmt w:val="decimal"/>
+      <w:lvlText w:val="%4."/>
+      <w:lvlJc w:val="left"/>
+      <w:pPr>
+        <w:ind w:left="2880" w:hanging="360"/>
+      </w:pPr>
+    </w:lvl>
+    <w:lvl w:ilvl="4" w:tplc="04150019" w:tentative="1">
+      <w:start w:val="1"/>
+      <w:numFmt w:val="lowerLetter"/>
+      <w:lvlText w:val="%5."/>
+      <w:lvlJc w:val="left"/>
+      <w:pPr>
+        <w:ind w:left="3600" w:hanging="360"/>
+      </w:pPr>
+    </w:lvl>
+    <w:lvl w:ilvl="5" w:tplc="0415001B" w:tentative="1">
+      <w:start w:val="1"/>
+      <w:numFmt w:val="lowerRoman"/>
+      <w:lvlText w:val="%6."/>
+      <w:lvlJc w:val="right"/>
+      <w:pPr>
+        <w:ind w:left="4320" w:hanging="180"/>
+      </w:pPr>
+    </w:lvl>
+    <w:lvl w:ilvl="6" w:tplc="0415000F" w:tentative="1">
+      <w:start w:val="1"/>
+      <w:numFmt w:val="decimal"/>
+      <w:lvlText w:val="%7."/>
+      <w:lvlJc w:val="left"/>
+      <w:pPr>
+        <w:ind w:left="5040" w:hanging="360"/>
+      </w:pPr>
+    </w:lvl>
+    <w:lvl w:ilvl="7" w:tplc="04150019" w:tentative="1">
+      <w:start w:val="1"/>
+      <w:numFmt w:val="lowerLetter"/>
+      <w:lvlText w:val="%8."/>
+      <w:lvlJc w:val="left"/>
+      <w:pPr>
+        <w:ind w:left="5760" w:hanging="360"/>
+      </w:pPr>
+    </w:lvl>
+    <w:lvl w:ilvl="8" w:tplc="0415001B" w:tentative="1">
+      <w:start w:val="1"/>
+      <w:numFmt w:val="lowerRoman"/>
+      <w:lvlText w:val="%9."/>
+      <w:lvlJc w:val="right"/>
+      <w:pPr>
+        <w:ind w:left="6480" w:hanging="180"/>
+      </w:pPr>
+    </w:lvl>
+  </w:abstractNum>
+  <w:num w:numId="1" w16cid:durableId="1236866280">
+    <w:abstractNumId w:val="1"/>
+  </w:num>
+  <w:num w:numId="2" w16cid:durableId="735396670">
+    <w:abstractNumId w:val="0"/>
+  </w:num>
+</w:numbering>
 </file>
 
 <file path=word/styles.xml><?xml version="1.0" encoding="utf-8"?>
@@ -616,7 +1957,6 @@
   <w:style w:type="character" w:default="1" w:styleId="Domylnaczcionkaakapitu">
     <w:name w:val="Default Paragraph Font"/>
     <w:uiPriority w:val="1"/>
-    <w:semiHidden/>
     <w:unhideWhenUsed/>
   </w:style>
   <w:style w:type="table" w:default="1" w:styleId="Standardowy">

</xml_diff>